<commit_message>
vault backup: 2026-10-18 15:27:17
</commit_message>
<xml_diff>
--- a/Visa/801 - Permanent Residency/Prepared Documents/Form 80 Attachment - Kristina Aleksandrova Warren - Reviewed Draft - WaKr-2631-801-3.docx
+++ b/Visa/801 - Permanent Residency/Prepared Documents/Form 80 Attachment - Kristina Aleksandrova Warren - Reviewed Draft - WaKr-2631-801-3.docx
@@ -7925,135 +7925,6 @@
         </w:trPr>
         <w:tc>
           <w:tcPr>
-            <w:shd w:fill="ffff00" w:val="clear"/>
-          </w:tcPr>
-          <w:p>
-            <w:pPr>
-              <w:jc w:val="center"/>
-              <w:rPr>
-                <w:sz w:val="20"/>
-                <w:szCs w:val="20"/>
-              </w:rPr>
-            </w:pPr>
-            <w:r>
-              <w:rPr>
-                <w:color w:val="ff0000"/>
-                <w:sz w:val="20"/>
-                <w:szCs w:val="20"/>
-                <w:rtl w:val="0"/>
-              </w:rPr>
-              <w:t xml:space="preserve">Add more rows as may be necessary</w:t>
-            </w:r>
-            <w:r>
-              <w:rPr>
-                <w:rtl w:val="0"/>
-              </w:rPr>
-            </w:r>
-          </w:p>
-        </w:tc>
-        <w:tc>
-          <w:tcPr>
-            <w:shd w:fill="ffff00" w:val="clear"/>
-          </w:tcPr>
-          <w:p>
-            <w:pPr>
-              <w:jc w:val="center"/>
-              <w:rPr>
-                <w:sz w:val="20"/>
-                <w:szCs w:val="20"/>
-              </w:rPr>
-            </w:pPr>
-            <w:r>
-              <w:rPr>
-                <w:rtl w:val="0"/>
-              </w:rPr>
-            </w:r>
-          </w:p>
-        </w:tc>
-        <w:tc>
-          <w:tcPr>
-            <w:shd w:fill="ffff00" w:val="clear"/>
-          </w:tcPr>
-          <w:p>
-            <w:pPr>
-              <w:jc w:val="center"/>
-              <w:rPr>
-                <w:sz w:val="20"/>
-                <w:szCs w:val="20"/>
-              </w:rPr>
-            </w:pPr>
-            <w:r>
-              <w:rPr>
-                <w:rtl w:val="0"/>
-              </w:rPr>
-            </w:r>
-          </w:p>
-        </w:tc>
-        <w:tc>
-          <w:tcPr>
-            <w:shd w:fill="ffff00" w:val="clear"/>
-          </w:tcPr>
-          <w:p>
-            <w:pPr>
-              <w:jc w:val="center"/>
-              <w:rPr>
-                <w:sz w:val="20"/>
-                <w:szCs w:val="20"/>
-              </w:rPr>
-            </w:pPr>
-            <w:r>
-              <w:rPr>
-                <w:rtl w:val="0"/>
-              </w:rPr>
-            </w:r>
-          </w:p>
-        </w:tc>
-        <w:tc>
-          <w:tcPr>
-            <w:shd w:fill="ffff00" w:val="clear"/>
-          </w:tcPr>
-          <w:p>
-            <w:pPr>
-              <w:jc w:val="center"/>
-              <w:rPr>
-                <w:sz w:val="20"/>
-                <w:szCs w:val="20"/>
-              </w:rPr>
-            </w:pPr>
-            <w:r>
-              <w:rPr>
-                <w:rtl w:val="0"/>
-              </w:rPr>
-            </w:r>
-          </w:p>
-        </w:tc>
-        <w:tc>
-          <w:tcPr>
-            <w:shd w:fill="ffff00" w:val="clear"/>
-          </w:tcPr>
-          <w:p>
-            <w:pPr>
-              <w:jc w:val="center"/>
-              <w:rPr>
-                <w:sz w:val="20"/>
-                <w:szCs w:val="20"/>
-              </w:rPr>
-            </w:pPr>
-            <w:r>
-              <w:rPr>
-                <w:rtl w:val="0"/>
-              </w:rPr>
-            </w:r>
-          </w:p>
-        </w:tc>
-      </w:tr>
-      <w:tr>
-        <w:trPr>
-          <w:cantSplit w:val="0"/>
-          <w:tblHeader w:val="0"/>
-        </w:trPr>
-        <w:tc>
-          <w:tcPr>
             <w:vAlign w:val="center"/>
           </w:tcPr>
           <w:p>
@@ -8349,27 +8220,6 @@
           <w:szCs w:val="28"/>
         </w:rPr>
       </w:pPr>
-      <w:r>
-        <w:rPr>
-          <w:rtl w:val="0"/>
-        </w:rPr>
-      </w:r>
-    </w:p>
-    <w:p>
-      <w:pPr>
-        <w:jc w:val="center"/>
-        <w:rPr/>
-      </w:pPr>
-      <w:r>
-        <w:rPr>
-          <w:b w:val="1"/>
-          <w:bCs w:val="1"/>
-          <w:sz w:val="28"/>
-          <w:szCs w:val="28"/>
-          <w:rtl w:val="0"/>
-        </w:rPr>
-        <w:t xml:space="preserve">Kristina Aleksandrova WARREN</w:t>
-      </w:r>
       <w:r>
         <w:rPr>
           <w:rtl w:val="0"/>

</xml_diff>